<commit_message>
Mission B Phase 2 — branding format + templates Pragmavox + doc session
- branding-format util: formatSiret, formatSiren, buildFooterFromTenant
- 12 unit tests pour branding-format
- template-engine service: footer dynamique depuis tenant (single source of truth)
- templates Pragmavox: lettre_mission_constitution (anonymisée) + mise_en_demeure_personne_morale (nouveau)
- .gitignore: exclure backend/backups/
- SESSION_REPRISE.md: bilan cleanup-9 + backlog mineur

Co-Authored-By: Claude Opus 4.7 (1M context) <noreply@anthropic.com>
</commit_message>
<xml_diff>
--- a/backend/templates/pragmavox/lettre_mission_constitution.template.docx
+++ b/backend/templates/pragmavox/lettre_mission_constitution.template.docx
@@ -5494,1721 +5494,8 @@
 </file>
 
 <file path=word/header1.xml><?xml version="1.0" encoding="utf-8"?>
-<w:hdr xmlns:mc="http://schemas.openxmlformats.org/markup-compatibility/2006" xmlns:ns10="urn:schemas-microsoft-com:vml" xmlns:ns11="urn:schemas-microsoft-com:office:office" xmlns:ns12="urn:schemas-microsoft-com:office:word" xmlns:ns3="http://schemas.openxmlformats.org/drawingml/2006/wordprocessingDrawing" xmlns:ns4="http://schemas.microsoft.com/office/word/2010/wordprocessingDrawing" xmlns:ns5="http://schemas.openxmlformats.org/drawingml/2006/main" xmlns:ns6="http://schemas.openxmlformats.org/drawingml/2006/picture" xmlns:ns7="http://schemas.openxmlformats.org/officeDocument/2006/relationships" xmlns:ns8="http://schemas.microsoft.com/office/drawing/2010/main" xmlns:ns9="http://schemas.microsoft.com/office/word/2010/wordprocessingShape" xmlns:w="http://schemas.openxmlformats.org/wordprocessingml/2006/main" xmlns:w14="http://schemas.microsoft.com/office/word/2010/wordml" mc:Ignorable="w14 w15 w16se w16cid w16 w16cex w16sdtdh w16sdtfl w16du wp14">
-  <w:p>
-    <w:pPr>
-      <w:pStyle w:val="StylePourEntete"/>
-      <w:jc w:val="center"/>
-    </w:pPr>
-    <w:r>
-      <w:drawing>
-        <ns3:inline distT="0" distB="0" distL="0" distR="0" ns4:anchorId="418A3E1F" ns4:editId="495A753D">
-          <ns3:extent cx="1990725" cy="1990725"/>
-          <ns3:effectExtent l="0" t="0" r="9525" b="9525"/>
-          <ns3:docPr id="936879273" name="Image 1"/>
-          <ns3:cNvGraphicFramePr>
-            <ns5:graphicFrameLocks noChangeAspect="1"/>
-          </ns3:cNvGraphicFramePr>
-          <ns5:graphic>
-            <ns5:graphicData uri="http://schemas.openxmlformats.org/drawingml/2006/picture">
-              <ns6:pic>
-                <ns6:nvPicPr>
-                  <ns6:cNvPr id="0" name="Picture 1"/>
-                  <ns6:cNvPicPr>
-                    <ns5:picLocks noChangeAspect="1" noChangeArrowheads="1"/>
-                  </ns6:cNvPicPr>
-                </ns6:nvPicPr>
-                <ns6:blipFill>
-                  <ns5:blip ns7:embed="rId1">
-                    <ns5:extLst>
-                      <ns5:ext uri="{28A0092B-C50C-407E-A947-70E740481C1C}">
-                        <ns8:useLocalDpi val="0"/>
-                      </ns5:ext>
-                    </ns5:extLst>
-                  </ns5:blip>
-                  <ns5:srcRect/>
-                  <ns5:stretch>
-                    <ns5:fillRect/>
-                  </ns5:stretch>
-                </ns6:blipFill>
-                <ns6:spPr bwMode="auto">
-                  <ns5:xfrm>
-                    <ns5:off x="0" y="0"/>
-                    <ns5:ext cx="1990725" cy="1990725"/>
-                  </ns5:xfrm>
-                  <ns5:prstGeom prst="rect">
-                    <ns5:avLst/>
-                  </ns5:prstGeom>
-                  <ns5:noFill/>
-                  <ns5:ln>
-                    <ns5:noFill/>
-                  </ns5:ln>
-                </ns6:spPr>
-              </ns6:pic>
-            </ns5:graphicData>
-          </ns5:graphic>
-        </ns3:inline>
-      </w:drawing>
-    </w:r>
-  </w:p>
-  <w:p>
-    <w:pPr>
-      <w:pStyle w:val="StylePourEntete"/>
-    </w:pPr>
-  </w:p>
-  <w:p>
-    <w:pPr>
-      <w:pStyle w:val="StylePourEntete"/>
-    </w:pPr>
-  </w:p>
-  <w:p>
-    <w:pPr>
-      <w:pStyle w:val="StylePourEntete"/>
-    </w:pPr>
-  </w:p>
-  <w:p>
-    <w:pPr>
-      <w:pStyle w:val="StylePourEntete"/>
-    </w:pPr>
-  </w:p>
-  <w:p>
-    <w:pPr>
-      <w:pStyle w:val="StylePourEntete"/>
-    </w:pPr>
-  </w:p>
-  <w:p>
-    <w:pPr>
-      <w:pStyle w:val="StylePourEntete"/>
-    </w:pPr>
-  </w:p>
-  <w:p>
-    <w:pPr>
-      <w:pStyle w:val="StylePourEntete"/>
-    </w:pPr>
-  </w:p>
-  <w:p>
-    <w:pPr>
-      <w:pStyle w:val="StylePourEntete"/>
-    </w:pPr>
-  </w:p>
-  <w:p>
-    <w:pPr>
-      <w:pStyle w:val="StylePourEntete"/>
-    </w:pPr>
-    <w:r>
-      <mc:AlternateContent>
-        <mc:Choice Requires="wps">
-          <w:drawing>
-            <ns3:anchor distT="0" distB="0" distL="114300" distR="114300" simplePos="0" relativeHeight="251660288" behindDoc="0" locked="0" layoutInCell="1" allowOverlap="1" ns4:anchorId="20873EC7" ns4:editId="0FC88700">
-              <ns3:simplePos x="0" y="0"/>
-              <ns3:positionH relativeFrom="page">
-                <ns3:posOffset>213995</ns3:posOffset>
-              </ns3:positionH>
-              <ns3:positionV relativeFrom="page">
-                <ns3:posOffset>2334895</ns3:posOffset>
-              </ns3:positionV>
-              <ns3:extent cx="2400300" cy="6972300"/>
-              <ns3:effectExtent l="0" t="0" r="0" b="0"/>
-              <ns3:wrapNone/>
-              <ns3:docPr id="5" name="Zone de texte 5"/>
-              <ns3:cNvGraphicFramePr>
-                <ns5:graphicFrameLocks/>
-              </ns3:cNvGraphicFramePr>
-              <ns5:graphic>
-                <ns5:graphicData uri="http://schemas.microsoft.com/office/word/2010/wordprocessingShape">
-                  <ns9:wsp>
-                    <ns9:cNvSpPr txBox="1">
-                      <ns5:spLocks noChangeArrowheads="1"/>
-                    </ns9:cNvSpPr>
-                    <ns9:spPr bwMode="auto">
-                      <ns5:xfrm>
-                        <ns5:off x="0" y="0"/>
-                        <ns5:ext cx="2400300" cy="6972300"/>
-                      </ns5:xfrm>
-                      <ns5:prstGeom prst="rect">
-                        <ns5:avLst/>
-                      </ns5:prstGeom>
-                      <ns5:noFill/>
-                      <ns5:ln>
-                        <ns5:noFill/>
-                      </ns5:ln>
-                      <ns5:extLst>
-                        <ns5:ext uri="{909E8E84-426E-40DD-AFC4-6F175D3DCCD1}">
-                          <ns8:hiddenFill>
-                            <ns5:solidFill>
-                              <ns5:srgbClr val="FFFFFF"/>
-                            </ns5:solidFill>
-                          </ns8:hiddenFill>
-                        </ns5:ext>
-                        <ns5:ext uri="{91240B29-F687-4F45-9708-019B960494DF}">
-                          <ns8:hiddenLine w="9525">
-                            <ns5:solidFill>
-                              <ns5:srgbClr val="000000"/>
-                            </ns5:solidFill>
-                            <ns5:miter lim="800000"/>
-                            <ns5:headEnd/>
-                            <ns5:tailEnd/>
-                          </ns8:hiddenLine>
-                        </ns5:ext>
-                      </ns5:extLst>
-                    </ns9:spPr>
-                    <ns9:txbx>
-                      <w:txbxContent>
-                        <w:p>
-                          <w:pPr>
-                            <w:pStyle w:val="StylePourEntete"/>
-                            <w:rPr>
-                              <w:rFonts w:ascii="Calibri" w:hAnsi="Calibri"/>
-                              <w:color w:val="808080"/>
-                              <w:sz w:val="18"/>
-                              <w:szCs w:val="18"/>
-                            </w:rPr>
-                          </w:pPr>
-                        </w:p>
-                        <w:p>
-                          <w:pPr>
-                            <w:pStyle w:val="StylePourEntete"/>
-                            <w:rPr>
-                              <w:rFonts w:ascii="Calibri" w:hAnsi="Calibri"/>
-                              <w:color w:val="808080"/>
-                              <w:sz w:val="18"/>
-                              <w:szCs w:val="18"/>
-                            </w:rPr>
-                          </w:pPr>
-                        </w:p>
-                        <w:p>
-                          <w:pPr>
-                            <w:pStyle w:val="StylePourEntete"/>
-                            <w:rPr>
-                              <w:rFonts w:ascii="Calibri" w:hAnsi="Calibri"/>
-                              <w:color w:val="808080"/>
-                              <w:sz w:val="18"/>
-                              <w:szCs w:val="18"/>
-                            </w:rPr>
-                          </w:pPr>
-                        </w:p>
-                        <w:p>
-                          <w:pPr>
-                            <w:pStyle w:val="StylePourEntete"/>
-                            <w:rPr>
-                              <w:rFonts w:ascii="Calibri" w:hAnsi="Calibri"/>
-                              <w:color w:val="808080"/>
-                              <w:sz w:val="18"/>
-                              <w:szCs w:val="18"/>
-                            </w:rPr>
-                          </w:pPr>
-                        </w:p>
-                        <w:p>
-                          <w:pPr>
-                            <w:pStyle w:val="StylePourEntete"/>
-                            <w:rPr>
-                              <w:rFonts w:ascii="Arial" w:hAnsi="Arial" w:cs="Arial"/>
-                              <w:b/>
-                              <w:color w:val="17365D"/>
-                              <w:sz w:val="18"/>
-                              <w:szCs w:val="18"/>
-                            </w:rPr>
-                          </w:pPr>
-                          <w:r>
-                            <w:rPr>
-                              <w:rFonts w:ascii="Arial" w:hAnsi="Arial" w:cs="Arial"/>
-                              <w:b/>
-                              <w:color w:val="17365D"/>
-                              <w:sz w:val="18"/>
-                              <w:szCs w:val="18"/>
-                            </w:rPr>
-                            <w:t>Yves-Marie BIENAIME</w:t>
-                          </w:r>
-                        </w:p>
-                        <w:p>
-                          <w:pPr>
-                            <w:pStyle w:val="StylePourEntete"/>
-                            <w:spacing w:line="360" w:lineRule="auto"/>
-                            <w:rPr>
-                              <w:rFonts w:ascii="Calibri" w:hAnsi="Calibri"/>
-                              <w:i/>
-                              <w:color w:val="808080"/>
-                              <w:sz w:val="18"/>
-                              <w:szCs w:val="18"/>
-                            </w:rPr>
-                          </w:pPr>
-                          <w:r>
-                            <w:rPr>
-                              <w:rFonts w:ascii="Calibri" w:hAnsi="Calibri"/>
-                              <w:i/>
-                              <w:color w:val="808080"/>
-                              <w:sz w:val="18"/>
-                              <w:szCs w:val="18"/>
-                            </w:rPr>
-                            <w:t xml:space="preserve">Avocat </w:t>
-                          </w:r>
-                        </w:p>
-                        <w:p>
-                          <w:pPr>
-                            <w:pStyle w:val="StylePourEntete"/>
-                            <w:spacing w:line="360" w:lineRule="auto"/>
-                            <w:rPr>
-                              <w:rFonts w:ascii="Calibri" w:hAnsi="Calibri"/>
-                              <w:i/>
-                              <w:color w:val="808080"/>
-                              <w:sz w:val="18"/>
-                              <w:szCs w:val="18"/>
-                            </w:rPr>
-                          </w:pPr>
-                        </w:p>
-                        <w:p>
-                          <w:pPr>
-                            <w:pStyle w:val="StylePourEntete"/>
-                            <w:spacing w:line="360" w:lineRule="auto"/>
-                            <w:rPr>
-                              <w:rFonts w:ascii="Calibri" w:hAnsi="Calibri"/>
-                              <w:i/>
-                              <w:color w:val="808080"/>
-                              <w:sz w:val="18"/>
-                              <w:szCs w:val="18"/>
-                            </w:rPr>
-                          </w:pPr>
-                          <w:r>
-                            <w:rPr>
-                              <w:rFonts w:ascii="Calibri" w:hAnsi="Calibri"/>
-                              <w:i/>
-                              <w:color w:val="808080"/>
-                              <w:sz w:val="18"/>
-                              <w:szCs w:val="18"/>
-                            </w:rPr>
-                            <w:t>Droit des sociétés</w:t>
-                          </w:r>
-                        </w:p>
-                        <w:p>
-                          <w:pPr>
-                            <w:pStyle w:val="StylePourEntete"/>
-                            <w:spacing w:line="360" w:lineRule="auto"/>
-                            <w:rPr>
-                              <w:rFonts w:ascii="Calibri" w:hAnsi="Calibri"/>
-                              <w:i/>
-                              <w:color w:val="808080"/>
-                              <w:sz w:val="18"/>
-                              <w:szCs w:val="18"/>
-                            </w:rPr>
-                          </w:pPr>
-                          <w:r>
-                            <w:rPr>
-                              <w:rFonts w:ascii="Calibri" w:hAnsi="Calibri"/>
-                              <w:i/>
-                              <w:color w:val="808080"/>
-                              <w:sz w:val="18"/>
-                              <w:szCs w:val="18"/>
-                            </w:rPr>
-                            <w:t>Droit commercial</w:t>
-                          </w:r>
-                        </w:p>
-                        <w:p>
-                          <w:pPr>
-                            <w:pStyle w:val="StylePourEntete"/>
-                            <w:spacing w:line="360" w:lineRule="auto"/>
-                            <w:rPr>
-                              <w:rFonts w:ascii="Calibri" w:hAnsi="Calibri"/>
-                              <w:i/>
-                              <w:color w:val="808080"/>
-                              <w:sz w:val="18"/>
-                              <w:szCs w:val="18"/>
-                            </w:rPr>
-                          </w:pPr>
-                          <w:r>
-                            <w:rPr>
-                              <w:rFonts w:ascii="Calibri" w:hAnsi="Calibri"/>
-                              <w:i/>
-                              <w:color w:val="808080"/>
-                              <w:sz w:val="18"/>
-                              <w:szCs w:val="18"/>
-                            </w:rPr>
-                            <w:t>Droit immobilier</w:t>
-                          </w:r>
-                        </w:p>
-                        <w:p>
-                          <w:pPr>
-                            <w:pStyle w:val="StylePourEntete"/>
-                            <w:spacing w:line="360" w:lineRule="auto"/>
-                            <w:rPr>
-                              <w:rFonts w:ascii="Calibri" w:hAnsi="Calibri"/>
-                              <w:i/>
-                              <w:color w:val="808080"/>
-                              <w:sz w:val="18"/>
-                              <w:szCs w:val="18"/>
-                            </w:rPr>
-                          </w:pPr>
-                        </w:p>
-                        <w:p>
-                          <w:pPr>
-                            <w:pStyle w:val="StylePourEntete"/>
-                            <w:spacing w:line="360" w:lineRule="auto"/>
-                            <w:rPr>
-                              <w:rFonts w:ascii="Calibri" w:hAnsi="Calibri"/>
-                              <w:i/>
-                              <w:color w:val="808080"/>
-                              <w:sz w:val="18"/>
-                              <w:szCs w:val="18"/>
-                            </w:rPr>
-                          </w:pPr>
-                        </w:p>
-                        <w:p>
-                          <w:pPr>
-                            <w:pStyle w:val="StylePourEntete"/>
-                            <w:spacing w:line="360" w:lineRule="auto"/>
-                            <w:rPr>
-                              <w:rFonts w:ascii="Calibri" w:hAnsi="Calibri"/>
-                              <w:i/>
-                              <w:color w:val="808080"/>
-                              <w:sz w:val="18"/>
-                              <w:szCs w:val="18"/>
-                            </w:rPr>
-                          </w:pPr>
-                        </w:p>
-                        <w:p>
-                          <w:pPr>
-                            <w:pStyle w:val="StylePourEntete"/>
-                            <w:spacing w:line="360" w:lineRule="auto"/>
-                            <w:rPr>
-                              <w:rFonts w:ascii="Calibri" w:hAnsi="Calibri"/>
-                              <w:i/>
-                              <w:color w:val="808080"/>
-                              <w:sz w:val="18"/>
-                              <w:szCs w:val="18"/>
-                            </w:rPr>
-                          </w:pPr>
-                          <w:r>
-                            <w:rPr>
-                              <w:rFonts w:ascii="Calibri" w:hAnsi="Calibri"/>
-                              <w:i/>
-                              <w:color w:val="808080"/>
-                              <w:sz w:val="18"/>
-                              <w:szCs w:val="18"/>
-                            </w:rPr>
-                            <w:t>11, rue Paul LANGEVIN</w:t>
-                          </w:r>
-                        </w:p>
-                        <w:p>
-                          <w:pPr>
-                            <w:pStyle w:val="StylePourEntete"/>
-                            <w:spacing w:line="360" w:lineRule="auto"/>
-                            <w:rPr>
-                              <w:rFonts w:ascii="Calibri" w:hAnsi="Calibri"/>
-                              <w:i/>
-                              <w:color w:val="808080"/>
-                              <w:sz w:val="18"/>
-                              <w:szCs w:val="18"/>
-                            </w:rPr>
-                          </w:pPr>
-                          <w:r>
-                            <w:rPr>
-                              <w:rFonts w:ascii="Calibri" w:hAnsi="Calibri"/>
-                              <w:i/>
-                              <w:color w:val="808080"/>
-                              <w:sz w:val="18"/>
-                              <w:szCs w:val="18"/>
-                            </w:rPr>
-                            <w:t>49240 AVRILLE</w:t>
-                          </w:r>
-                        </w:p>
-                        <w:p>
-                          <w:pPr>
-                            <w:pStyle w:val="StylePourEntete"/>
-                            <w:spacing w:line="360" w:lineRule="auto"/>
-                            <w:rPr>
-                              <w:rFonts w:ascii="Calibri" w:hAnsi="Calibri"/>
-                              <w:i/>
-                              <w:color w:val="808080"/>
-                              <w:sz w:val="18"/>
-                              <w:szCs w:val="18"/>
-                            </w:rPr>
-                          </w:pPr>
-                          <w:r>
-                            <w:rPr>
-                              <w:rFonts w:ascii="Calibri" w:hAnsi="Calibri"/>
-                              <w:i/>
-                              <w:color w:val="808080"/>
-                              <w:sz w:val="18"/>
-                              <w:szCs w:val="18"/>
-                            </w:rPr>
-                            <w:t>Tel : 06.14.84.38.38</w:t>
-                          </w:r>
-                        </w:p>
-                        <w:p>
-                          <w:pPr>
-                            <w:pStyle w:val="StylePourEntete"/>
-                            <w:spacing w:line="360" w:lineRule="auto"/>
-                            <w:rPr>
-                              <w:rFonts w:ascii="Calibri" w:hAnsi="Calibri"/>
-                              <w:i/>
-                              <w:color w:val="808080"/>
-                              <w:sz w:val="18"/>
-                              <w:szCs w:val="18"/>
-                            </w:rPr>
-                          </w:pPr>
-                          <w:r>
-                            <w:rPr>
-                              <w:rFonts w:ascii="Calibri" w:hAnsi="Calibri"/>
-                              <w:i/>
-                              <w:color w:val="808080"/>
-                              <w:sz w:val="18"/>
-                              <w:szCs w:val="18"/>
-                            </w:rPr>
-                            <w:t>Mail :</w:t>
-                          </w:r>
-                          <w:r>
-                            <w:rPr>
-                              <w:rFonts w:ascii="Calibri" w:hAnsi="Calibri"/>
-                              <w:i/>
-                              <w:color w:val="808080"/>
-                              <w:sz w:val="18"/>
-                              <w:szCs w:val="18"/>
-                            </w:rPr>
-                            <w:t xml:space="preserve"> </w:t>
-                          </w:r>
-                          <w:hyperlink ns7:id="rId2" w:history="1">
-                            <w:r>
-                              <w:rPr>
-                                <w:rStyle w:val="Lienhypertexte"/>
-                                <w:rFonts w:ascii="Calibri" w:hAnsi="Calibri"/>
-                                <w:i/>
-                                <w:sz w:val="18"/>
-                                <w:szCs w:val="18"/>
-                              </w:rPr>
-                              <w:t>ym.bienaime@pragmavox-avocat.fr</w:t>
-                            </w:r>
-                          </w:hyperlink>
-                        </w:p>
-                        <w:p>
-                          <w:pPr>
-                            <w:pStyle w:val="StylePourEntete"/>
-                            <w:spacing w:line="360" w:lineRule="auto"/>
-                            <w:rPr>
-                              <w:rFonts w:ascii="Calibri" w:hAnsi="Calibri"/>
-                              <w:i/>
-                              <w:color w:val="808080"/>
-                              <w:sz w:val="18"/>
-                              <w:szCs w:val="18"/>
-                            </w:rPr>
-                          </w:pPr>
-                          <w:r>
-                            <w:rPr>
-                              <w:rFonts w:ascii="Calibri" w:hAnsi="Calibri"/>
-                              <w:i/>
-                              <w:color w:val="808080"/>
-                              <w:sz w:val="18"/>
-                              <w:szCs w:val="18"/>
-                            </w:rPr>
-                            <w:t xml:space="preserve">Mail 2 : </w:t>
-                          </w:r>
-                          <w:hyperlink ns7:id="rId3" w:history="1">
-                            <w:r>
-                              <w:rPr>
-                                <w:rStyle w:val="Lienhypertexte"/>
-                                <w:rFonts w:ascii="Calibri" w:hAnsi="Calibri"/>
-                                <w:i/>
-                                <w:sz w:val="18"/>
-                                <w:szCs w:val="18"/>
-                              </w:rPr>
-                              <w:t>pragmavox.avocat@gmail.com</w:t>
-                            </w:r>
-                          </w:hyperlink>
-                        </w:p>
-                        <w:p>
-                          <w:pPr>
-                            <w:pStyle w:val="StylePourEntete"/>
-                            <w:spacing w:line="360" w:lineRule="auto"/>
-                            <w:rPr>
-                              <w:rFonts w:ascii="Calibri" w:hAnsi="Calibri"/>
-                              <w:i/>
-                              <w:color w:val="808080"/>
-                              <w:sz w:val="18"/>
-                              <w:szCs w:val="18"/>
-                            </w:rPr>
-                          </w:pPr>
-                        </w:p>
-                        <w:p>
-                          <w:pPr>
-                            <w:pStyle w:val="StylePourEntete"/>
-                            <w:spacing w:line="360" w:lineRule="auto"/>
-                            <w:rPr>
-                              <w:rFonts w:ascii="Calibri" w:hAnsi="Calibri"/>
-                              <w:i/>
-                              <w:color w:val="808080"/>
-                              <w:sz w:val="18"/>
-                              <w:szCs w:val="18"/>
-                            </w:rPr>
-                          </w:pPr>
-                        </w:p>
-                        <w:p>
-                          <w:pPr>
-                            <w:pStyle w:val="StylePourEntete"/>
-                            <w:spacing w:line="360" w:lineRule="auto"/>
-                            <w:rPr>
-                              <w:rFonts w:ascii="Calibri" w:hAnsi="Calibri"/>
-                              <w:i/>
-                              <w:color w:val="808080"/>
-                              <w:sz w:val="18"/>
-                              <w:szCs w:val="18"/>
-                            </w:rPr>
-                          </w:pPr>
-                        </w:p>
-                        <w:p>
-                          <w:pPr>
-                            <w:pStyle w:val="StylePourEntete"/>
-                            <w:spacing w:line="360" w:lineRule="auto"/>
-                            <w:rPr>
-                              <w:rFonts w:ascii="Calibri" w:hAnsi="Calibri"/>
-                              <w:i/>
-                              <w:color w:val="808080"/>
-                              <w:sz w:val="18"/>
-                              <w:szCs w:val="18"/>
-                            </w:rPr>
-                          </w:pPr>
-                        </w:p>
-                        <w:p>
-                          <w:pPr>
-                            <w:pStyle w:val="StylePourEntete"/>
-                            <w:spacing w:line="360" w:lineRule="auto"/>
-                            <w:rPr>
-                              <w:rFonts w:ascii="Calibri" w:hAnsi="Calibri"/>
-                              <w:i/>
-                              <w:color w:val="808080"/>
-                              <w:sz w:val="18"/>
-                              <w:szCs w:val="18"/>
-                            </w:rPr>
-                          </w:pPr>
-                        </w:p>
-                        <w:p>
-                          <w:pPr>
-                            <w:pStyle w:val="StylePourEntete"/>
-                            <w:spacing w:line="360" w:lineRule="auto"/>
-                            <w:rPr>
-                              <w:rFonts w:ascii="Calibri" w:hAnsi="Calibri"/>
-                              <w:i/>
-                              <w:color w:val="808080"/>
-                              <w:sz w:val="18"/>
-                              <w:szCs w:val="18"/>
-                            </w:rPr>
-                          </w:pPr>
-                        </w:p>
-                        <w:p>
-                          <w:pPr>
-                            <w:pStyle w:val="StylePourEntete"/>
-                            <w:spacing w:line="360" w:lineRule="auto"/>
-                            <w:rPr>
-                              <w:rFonts w:ascii="Calibri" w:hAnsi="Calibri"/>
-                              <w:i/>
-                              <w:color w:val="808080"/>
-                              <w:sz w:val="18"/>
-                              <w:szCs w:val="18"/>
-                            </w:rPr>
-                          </w:pPr>
-                        </w:p>
-                        <w:p>
-                          <w:pPr>
-                            <w:pStyle w:val="StylePourEntete"/>
-                            <w:spacing w:line="360" w:lineRule="auto"/>
-                            <w:rPr>
-                              <w:rFonts w:ascii="Calibri" w:hAnsi="Calibri"/>
-                              <w:i/>
-                              <w:color w:val="808080"/>
-                              <w:sz w:val="18"/>
-                              <w:szCs w:val="18"/>
-                            </w:rPr>
-                          </w:pPr>
-                        </w:p>
-                        <w:p>
-                          <w:pPr>
-                            <w:pStyle w:val="StylePourEntete"/>
-                            <w:spacing w:line="360" w:lineRule="auto"/>
-                            <w:rPr>
-                              <w:rFonts w:ascii="Calibri" w:hAnsi="Calibri"/>
-                              <w:i/>
-                              <w:color w:val="808080"/>
-                              <w:sz w:val="18"/>
-                              <w:szCs w:val="18"/>
-                            </w:rPr>
-                          </w:pPr>
-                        </w:p>
-                        <w:p>
-                          <w:pPr>
-                            <w:pStyle w:val="StylePourEntete"/>
-                            <w:spacing w:line="360" w:lineRule="auto"/>
-                            <w:rPr>
-                              <w:rFonts w:ascii="Calibri" w:hAnsi="Calibri"/>
-                              <w:i/>
-                              <w:color w:val="808080"/>
-                              <w:sz w:val="18"/>
-                              <w:szCs w:val="18"/>
-                            </w:rPr>
-                          </w:pPr>
-                        </w:p>
-                        <w:p>
-                          <w:pPr>
-                            <w:pStyle w:val="StylePourEntete"/>
-                            <w:spacing w:line="360" w:lineRule="auto"/>
-                            <w:rPr>
-                              <w:rFonts w:ascii="Calibri" w:hAnsi="Calibri"/>
-                              <w:i/>
-                              <w:color w:val="808080"/>
-                              <w:sz w:val="18"/>
-                              <w:szCs w:val="18"/>
-                            </w:rPr>
-                          </w:pPr>
-                        </w:p>
-                        <w:p>
-                          <w:pPr>
-                            <w:pStyle w:val="StylePourEntete"/>
-                            <w:spacing w:line="360" w:lineRule="auto"/>
-                            <w:rPr>
-                              <w:rFonts w:ascii="Calibri" w:hAnsi="Calibri"/>
-                              <w:i/>
-                              <w:color w:val="808080"/>
-                              <w:sz w:val="18"/>
-                              <w:szCs w:val="18"/>
-                            </w:rPr>
-                          </w:pPr>
-                          <w:r>
-                            <w:rPr>
-                              <w:rFonts w:ascii="Calibri" w:hAnsi="Calibri"/>
-                              <w:i/>
-                              <w:color w:val="808080"/>
-                              <w:sz w:val="18"/>
-                              <w:szCs w:val="18"/>
-                            </w:rPr>
-                            <w:t>SELARL D’AVOCAT</w:t>
-                          </w:r>
-                        </w:p>
-                        <w:p>
-                          <w:pPr>
-                            <w:pStyle w:val="StylePourEntete"/>
-                            <w:spacing w:line="360" w:lineRule="auto"/>
-                            <w:rPr>
-                              <w:rFonts w:ascii="Calibri" w:hAnsi="Calibri"/>
-                              <w:i/>
-                              <w:color w:val="808080"/>
-                              <w:sz w:val="18"/>
-                              <w:szCs w:val="18"/>
-                              <w:lang w:val="en-US"/>
-                            </w:rPr>
-                          </w:pPr>
-                          <w:r>
-                            <w:rPr>
-                              <w:rFonts w:ascii="Calibri" w:hAnsi="Calibri"/>
-                              <w:i/>
-                              <w:color w:val="808080"/>
-                              <w:sz w:val="18"/>
-                              <w:szCs w:val="18"/>
-                              <w:lang w:val="en-US"/>
-                            </w:rPr>
-                            <w:t xml:space="preserve">Siret : </w:t>
-                          </w:r>
-                          <w:r>
-                            <w:rPr>
-                              <w:rFonts w:ascii="Calibri" w:hAnsi="Calibri"/>
-                              <w:i/>
-                              <w:color w:val="808080"/>
-                              <w:sz w:val="18"/>
-                              <w:szCs w:val="18"/>
-                              <w:lang w:val="en-US"/>
-                            </w:rPr>
-                            <w:t>98260027200016</w:t>
-                          </w:r>
-                        </w:p>
-                        <w:p>
-                          <w:pPr>
-                            <w:pStyle w:val="StylePourEntete"/>
-                            <w:spacing w:line="360" w:lineRule="auto"/>
-                            <w:rPr>
-                              <w:rFonts w:ascii="Calibri" w:hAnsi="Calibri"/>
-                              <w:i/>
-                              <w:color w:val="808080"/>
-                              <w:sz w:val="18"/>
-                              <w:szCs w:val="18"/>
-                              <w:lang w:val="en-US"/>
-                            </w:rPr>
-                          </w:pPr>
-                          <w:r>
-                            <w:rPr>
-                              <w:rFonts w:ascii="Calibri" w:hAnsi="Calibri"/>
-                              <w:i/>
-                              <w:color w:val="808080"/>
-                              <w:sz w:val="18"/>
-                              <w:szCs w:val="18"/>
-                              <w:lang w:val="en-US"/>
-                            </w:rPr>
-                            <w:t xml:space="preserve">N° TVA : </w:t>
-                          </w:r>
-                          <w:r>
-                            <w:rPr>
-                              <w:rFonts w:ascii="Calibri" w:hAnsi="Calibri"/>
-                              <w:i/>
-                              <w:color w:val="808080"/>
-                              <w:sz w:val="18"/>
-                              <w:szCs w:val="18"/>
-                              <w:lang w:val="en-US"/>
-                            </w:rPr>
-                            <w:t>FR25982600272</w:t>
-                          </w:r>
-                        </w:p>
-                        <w:p>
-                          <w:pPr>
-                            <w:pStyle w:val="StylePourEntete"/>
-                            <w:spacing w:line="360" w:lineRule="auto"/>
-                            <w:rPr>
-                              <w:rFonts w:ascii="Calibri" w:hAnsi="Calibri"/>
-                              <w:i/>
-                              <w:color w:val="808080"/>
-                              <w:sz w:val="18"/>
-                              <w:szCs w:val="18"/>
-                              <w:lang w:val="en-US"/>
-                            </w:rPr>
-                          </w:pPr>
-                        </w:p>
-                        <w:p>
-                          <w:pPr>
-                            <w:pStyle w:val="StylePourEntete"/>
-                            <w:spacing w:line="360" w:lineRule="auto"/>
-                            <w:rPr>
-                              <w:rFonts w:ascii="Calibri" w:hAnsi="Calibri"/>
-                              <w:i/>
-                              <w:color w:val="808080"/>
-                              <w:sz w:val="18"/>
-                              <w:szCs w:val="18"/>
-                              <w:lang w:val="en-US"/>
-                            </w:rPr>
-                          </w:pPr>
-                        </w:p>
-                        <w:p>
-                          <w:pPr>
-                            <w:pStyle w:val="StylePourEntete"/>
-                            <w:spacing w:line="360" w:lineRule="auto"/>
-                            <w:rPr>
-                              <w:rFonts w:ascii="Calibri" w:hAnsi="Calibri"/>
-                              <w:i/>
-                              <w:color w:val="808080"/>
-                              <w:sz w:val="18"/>
-                              <w:szCs w:val="18"/>
-                              <w:lang w:val="en-US"/>
-                            </w:rPr>
-                          </w:pPr>
-                        </w:p>
-                        <w:p>
-                          <w:pPr>
-                            <w:pStyle w:val="StylePourEntete"/>
-                            <w:spacing w:line="360" w:lineRule="auto"/>
-                            <w:rPr>
-                              <w:rFonts w:ascii="Calibri" w:hAnsi="Calibri"/>
-                              <w:i/>
-                              <w:color w:val="808080"/>
-                              <w:sz w:val="18"/>
-                              <w:szCs w:val="18"/>
-                              <w:lang w:val="en-US"/>
-                            </w:rPr>
-                          </w:pPr>
-                        </w:p>
-                        <w:p>
-                          <w:pPr>
-                            <w:pStyle w:val="StylePourEntete"/>
-                            <w:spacing w:line="360" w:lineRule="auto"/>
-                            <w:rPr>
-                              <w:rFonts w:ascii="Calibri" w:hAnsi="Calibri"/>
-                              <w:i/>
-                              <w:color w:val="808080"/>
-                              <w:sz w:val="18"/>
-                              <w:szCs w:val="18"/>
-                              <w:lang w:val="en-US"/>
-                            </w:rPr>
-                          </w:pPr>
-                        </w:p>
-                        <w:p>
-                          <w:pPr>
-                            <w:pStyle w:val="StylePourEntete"/>
-                            <w:spacing w:line="360" w:lineRule="auto"/>
-                            <w:rPr>
-                              <w:rFonts w:ascii="Calibri" w:hAnsi="Calibri"/>
-                              <w:i/>
-                              <w:color w:val="808080"/>
-                              <w:sz w:val="18"/>
-                              <w:szCs w:val="18"/>
-                              <w:lang w:val="en-US"/>
-                            </w:rPr>
-                          </w:pPr>
-                        </w:p>
-                        <w:p>
-                          <w:pPr>
-                            <w:pStyle w:val="StylePourEntete"/>
-                            <w:rPr>
-                              <w:rFonts w:ascii="Calibri" w:hAnsi="Calibri"/>
-                              <w:color w:val="808080"/>
-                              <w:sz w:val="18"/>
-                              <w:szCs w:val="18"/>
-                              <w:lang w:val="en-US"/>
-                            </w:rPr>
-                          </w:pPr>
-                        </w:p>
-                        <w:p>
-                          <w:pPr>
-                            <w:pStyle w:val="StylePourEntete"/>
-                            <w:rPr>
-                              <w:rFonts w:ascii="Calibri" w:hAnsi="Calibri"/>
-                              <w:color w:val="808080"/>
-                              <w:sz w:val="18"/>
-                              <w:szCs w:val="18"/>
-                              <w:lang w:val="en-US"/>
-                            </w:rPr>
-                          </w:pPr>
-                        </w:p>
-                        <w:p>
-                          <w:pPr>
-                            <w:pStyle w:val="StylePourEntete"/>
-                            <w:rPr>
-                              <w:rFonts w:ascii="Calibri" w:hAnsi="Calibri"/>
-                              <w:b/>
-                              <w:color w:val="17365D"/>
-                              <w:sz w:val="18"/>
-                              <w:szCs w:val="18"/>
-                              <w:lang w:val="en-US"/>
-                            </w:rPr>
-                          </w:pPr>
-                        </w:p>
-                        <w:p>
-                          <w:pPr>
-                            <w:pStyle w:val="StylePourEntete"/>
-                            <w:rPr>
-                              <w:rFonts w:ascii="Calibri" w:hAnsi="Calibri"/>
-                              <w:i/>
-                              <w:color w:val="808080"/>
-                              <w:sz w:val="18"/>
-                              <w:szCs w:val="18"/>
-                              <w:lang w:val="en-US"/>
-                            </w:rPr>
-                          </w:pPr>
-                        </w:p>
-                        <w:p>
-                          <w:pPr>
-                            <w:pStyle w:val="StylePourEntete"/>
-                            <w:rPr>
-                              <w:rFonts w:ascii="Calibri" w:hAnsi="Calibri"/>
-                              <w:color w:val="808080"/>
-                              <w:sz w:val="18"/>
-                              <w:szCs w:val="18"/>
-                              <w:lang w:val="en-US"/>
-                            </w:rPr>
-                          </w:pPr>
-                        </w:p>
-                        <w:p>
-                          <w:pPr>
-                            <w:pStyle w:val="StylePourEntete"/>
-                            <w:rPr>
-                              <w:rFonts w:ascii="Calibri" w:hAnsi="Calibri"/>
-                              <w:color w:val="808080"/>
-                              <w:sz w:val="18"/>
-                              <w:szCs w:val="18"/>
-                              <w:lang w:val="en-US"/>
-                            </w:rPr>
-                          </w:pPr>
-                        </w:p>
-                      </w:txbxContent>
-                    </ns9:txbx>
-                    <ns9:bodyPr rot="0" vert="horz" wrap="square" lIns="91440" tIns="45720" rIns="91440" bIns="45720" anchor="t" anchorCtr="0" upright="1">
-                      <ns5:noAutofit/>
-                    </ns9:bodyPr>
-                  </ns9:wsp>
-                </ns5:graphicData>
-              </ns5:graphic>
-              <ns4:sizeRelH relativeFrom="page">
-                <ns4:pctWidth>0</ns4:pctWidth>
-              </ns4:sizeRelH>
-              <ns4:sizeRelV relativeFrom="page">
-                <ns4:pctHeight>0</ns4:pctHeight>
-              </ns4:sizeRelV>
-            </ns3:anchor>
-          </w:drawing>
-        </mc:Choice>
-        <mc:Fallback>
-          <w:pict>
-            <ns10:shapetype w14:anchorId="20873EC7" id="_x0000_t202" coordsize="21600,21600" ns11:spt="202" path="m,l,21600r21600,l21600,xe">
-              <ns10:stroke joinstyle="miter"/>
-              <ns10:path gradientshapeok="t" ns11:connecttype="rect"/>
-            </ns10:shapetype>
-            <ns10:shape id="Zone de texte 5" ns11:spid="_x0000_s1026" type="#_x0000_t202" style="position:absolute;margin-left:16.85pt;margin-top:183.85pt;width:189pt;height:549pt;z-index:251660288;visibility:visible;mso-wrap-style:square;mso-width-percent:0;mso-height-percent:0;mso-wrap-distance-left:9pt;mso-wrap-distance-top:0;mso-wrap-distance-right:9pt;mso-wrap-distance-bottom:0;mso-position-horizontal:absolute;mso-position-horizontal-relative:page;mso-position-vertical:absolute;mso-position-vertical-relative:page;mso-width-percent:0;mso-height-percent:0;mso-width-relative:page;mso-height-relative:page;v-text-anchor:top" ns11:gfxdata="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" filled="f" stroked="f">
-              <ns10:textbox>
-                <w:txbxContent>
-                  <w:p>
-                    <w:pPr>
-                      <w:pStyle w:val="StylePourEntete"/>
-                      <w:rPr>
-                        <w:rFonts w:ascii="Calibri" w:hAnsi="Calibri"/>
-                        <w:color w:val="808080"/>
-                        <w:sz w:val="18"/>
-                        <w:szCs w:val="18"/>
-                      </w:rPr>
-                    </w:pPr>
-                  </w:p>
-                  <w:p>
-                    <w:pPr>
-                      <w:pStyle w:val="StylePourEntete"/>
-                      <w:rPr>
-                        <w:rFonts w:ascii="Calibri" w:hAnsi="Calibri"/>
-                        <w:color w:val="808080"/>
-                        <w:sz w:val="18"/>
-                        <w:szCs w:val="18"/>
-                      </w:rPr>
-                    </w:pPr>
-                  </w:p>
-                  <w:p>
-                    <w:pPr>
-                      <w:pStyle w:val="StylePourEntete"/>
-                      <w:rPr>
-                        <w:rFonts w:ascii="Calibri" w:hAnsi="Calibri"/>
-                        <w:color w:val="808080"/>
-                        <w:sz w:val="18"/>
-                        <w:szCs w:val="18"/>
-                      </w:rPr>
-                    </w:pPr>
-                  </w:p>
-                  <w:p>
-                    <w:pPr>
-                      <w:pStyle w:val="StylePourEntete"/>
-                      <w:rPr>
-                        <w:rFonts w:ascii="Calibri" w:hAnsi="Calibri"/>
-                        <w:color w:val="808080"/>
-                        <w:sz w:val="18"/>
-                        <w:szCs w:val="18"/>
-                      </w:rPr>
-                    </w:pPr>
-                  </w:p>
-                  <w:p>
-                    <w:pPr>
-                      <w:pStyle w:val="StylePourEntete"/>
-                      <w:rPr>
-                        <w:rFonts w:ascii="Arial" w:hAnsi="Arial" w:cs="Arial"/>
-                        <w:b/>
-                        <w:color w:val="17365D"/>
-                        <w:sz w:val="18"/>
-                        <w:szCs w:val="18"/>
-                      </w:rPr>
-                    </w:pPr>
-                    <w:r>
-                      <w:rPr>
-                        <w:rFonts w:ascii="Arial" w:hAnsi="Arial" w:cs="Arial"/>
-                        <w:b/>
-                        <w:color w:val="17365D"/>
-                        <w:sz w:val="18"/>
-                        <w:szCs w:val="18"/>
-                      </w:rPr>
-                      <w:t>Yves-Marie BIENAIME</w:t>
-                    </w:r>
-                  </w:p>
-                  <w:p>
-                    <w:pPr>
-                      <w:pStyle w:val="StylePourEntete"/>
-                      <w:spacing w:line="360" w:lineRule="auto"/>
-                      <w:rPr>
-                        <w:rFonts w:ascii="Calibri" w:hAnsi="Calibri"/>
-                        <w:i/>
-                        <w:color w:val="808080"/>
-                        <w:sz w:val="18"/>
-                        <w:szCs w:val="18"/>
-                      </w:rPr>
-                    </w:pPr>
-                    <w:r>
-                      <w:rPr>
-                        <w:rFonts w:ascii="Calibri" w:hAnsi="Calibri"/>
-                        <w:i/>
-                        <w:color w:val="808080"/>
-                        <w:sz w:val="18"/>
-                        <w:szCs w:val="18"/>
-                      </w:rPr>
-                      <w:t xml:space="preserve">Avocat </w:t>
-                    </w:r>
-                  </w:p>
-                  <w:p>
-                    <w:pPr>
-                      <w:pStyle w:val="StylePourEntete"/>
-                      <w:spacing w:line="360" w:lineRule="auto"/>
-                      <w:rPr>
-                        <w:rFonts w:ascii="Calibri" w:hAnsi="Calibri"/>
-                        <w:i/>
-                        <w:color w:val="808080"/>
-                        <w:sz w:val="18"/>
-                        <w:szCs w:val="18"/>
-                      </w:rPr>
-                    </w:pPr>
-                  </w:p>
-                  <w:p>
-                    <w:pPr>
-                      <w:pStyle w:val="StylePourEntete"/>
-                      <w:spacing w:line="360" w:lineRule="auto"/>
-                      <w:rPr>
-                        <w:rFonts w:ascii="Calibri" w:hAnsi="Calibri"/>
-                        <w:i/>
-                        <w:color w:val="808080"/>
-                        <w:sz w:val="18"/>
-                        <w:szCs w:val="18"/>
-                      </w:rPr>
-                    </w:pPr>
-                    <w:r>
-                      <w:rPr>
-                        <w:rFonts w:ascii="Calibri" w:hAnsi="Calibri"/>
-                        <w:i/>
-                        <w:color w:val="808080"/>
-                        <w:sz w:val="18"/>
-                        <w:szCs w:val="18"/>
-                      </w:rPr>
-                      <w:t>Droit des sociétés</w:t>
-                    </w:r>
-                  </w:p>
-                  <w:p>
-                    <w:pPr>
-                      <w:pStyle w:val="StylePourEntete"/>
-                      <w:spacing w:line="360" w:lineRule="auto"/>
-                      <w:rPr>
-                        <w:rFonts w:ascii="Calibri" w:hAnsi="Calibri"/>
-                        <w:i/>
-                        <w:color w:val="808080"/>
-                        <w:sz w:val="18"/>
-                        <w:szCs w:val="18"/>
-                      </w:rPr>
-                    </w:pPr>
-                    <w:r>
-                      <w:rPr>
-                        <w:rFonts w:ascii="Calibri" w:hAnsi="Calibri"/>
-                        <w:i/>
-                        <w:color w:val="808080"/>
-                        <w:sz w:val="18"/>
-                        <w:szCs w:val="18"/>
-                      </w:rPr>
-                      <w:t>Droit commercial</w:t>
-                    </w:r>
-                  </w:p>
-                  <w:p>
-                    <w:pPr>
-                      <w:pStyle w:val="StylePourEntete"/>
-                      <w:spacing w:line="360" w:lineRule="auto"/>
-                      <w:rPr>
-                        <w:rFonts w:ascii="Calibri" w:hAnsi="Calibri"/>
-                        <w:i/>
-                        <w:color w:val="808080"/>
-                        <w:sz w:val="18"/>
-                        <w:szCs w:val="18"/>
-                      </w:rPr>
-                    </w:pPr>
-                    <w:r>
-                      <w:rPr>
-                        <w:rFonts w:ascii="Calibri" w:hAnsi="Calibri"/>
-                        <w:i/>
-                        <w:color w:val="808080"/>
-                        <w:sz w:val="18"/>
-                        <w:szCs w:val="18"/>
-                      </w:rPr>
-                      <w:t>Droit immobilier</w:t>
-                    </w:r>
-                  </w:p>
-                  <w:p>
-                    <w:pPr>
-                      <w:pStyle w:val="StylePourEntete"/>
-                      <w:spacing w:line="360" w:lineRule="auto"/>
-                      <w:rPr>
-                        <w:rFonts w:ascii="Calibri" w:hAnsi="Calibri"/>
-                        <w:i/>
-                        <w:color w:val="808080"/>
-                        <w:sz w:val="18"/>
-                        <w:szCs w:val="18"/>
-                      </w:rPr>
-                    </w:pPr>
-                  </w:p>
-                  <w:p>
-                    <w:pPr>
-                      <w:pStyle w:val="StylePourEntete"/>
-                      <w:spacing w:line="360" w:lineRule="auto"/>
-                      <w:rPr>
-                        <w:rFonts w:ascii="Calibri" w:hAnsi="Calibri"/>
-                        <w:i/>
-                        <w:color w:val="808080"/>
-                        <w:sz w:val="18"/>
-                        <w:szCs w:val="18"/>
-                      </w:rPr>
-                    </w:pPr>
-                  </w:p>
-                  <w:p>
-                    <w:pPr>
-                      <w:pStyle w:val="StylePourEntete"/>
-                      <w:spacing w:line="360" w:lineRule="auto"/>
-                      <w:rPr>
-                        <w:rFonts w:ascii="Calibri" w:hAnsi="Calibri"/>
-                        <w:i/>
-                        <w:color w:val="808080"/>
-                        <w:sz w:val="18"/>
-                        <w:szCs w:val="18"/>
-                      </w:rPr>
-                    </w:pPr>
-                  </w:p>
-                  <w:p>
-                    <w:pPr>
-                      <w:pStyle w:val="StylePourEntete"/>
-                      <w:spacing w:line="360" w:lineRule="auto"/>
-                      <w:rPr>
-                        <w:rFonts w:ascii="Calibri" w:hAnsi="Calibri"/>
-                        <w:i/>
-                        <w:color w:val="808080"/>
-                        <w:sz w:val="18"/>
-                        <w:szCs w:val="18"/>
-                      </w:rPr>
-                    </w:pPr>
-                    <w:r>
-                      <w:rPr>
-                        <w:rFonts w:ascii="Calibri" w:hAnsi="Calibri"/>
-                        <w:i/>
-                        <w:color w:val="808080"/>
-                        <w:sz w:val="18"/>
-                        <w:szCs w:val="18"/>
-                      </w:rPr>
-                      <w:t>11, rue Paul LANGEVIN</w:t>
-                    </w:r>
-                  </w:p>
-                  <w:p>
-                    <w:pPr>
-                      <w:pStyle w:val="StylePourEntete"/>
-                      <w:spacing w:line="360" w:lineRule="auto"/>
-                      <w:rPr>
-                        <w:rFonts w:ascii="Calibri" w:hAnsi="Calibri"/>
-                        <w:i/>
-                        <w:color w:val="808080"/>
-                        <w:sz w:val="18"/>
-                        <w:szCs w:val="18"/>
-                      </w:rPr>
-                    </w:pPr>
-                    <w:r>
-                      <w:rPr>
-                        <w:rFonts w:ascii="Calibri" w:hAnsi="Calibri"/>
-                        <w:i/>
-                        <w:color w:val="808080"/>
-                        <w:sz w:val="18"/>
-                        <w:szCs w:val="18"/>
-                      </w:rPr>
-                      <w:t>49240 AVRILLE</w:t>
-                    </w:r>
-                  </w:p>
-                  <w:p>
-                    <w:pPr>
-                      <w:pStyle w:val="StylePourEntete"/>
-                      <w:spacing w:line="360" w:lineRule="auto"/>
-                      <w:rPr>
-                        <w:rFonts w:ascii="Calibri" w:hAnsi="Calibri"/>
-                        <w:i/>
-                        <w:color w:val="808080"/>
-                        <w:sz w:val="18"/>
-                        <w:szCs w:val="18"/>
-                      </w:rPr>
-                    </w:pPr>
-                    <w:r>
-                      <w:rPr>
-                        <w:rFonts w:ascii="Calibri" w:hAnsi="Calibri"/>
-                        <w:i/>
-                        <w:color w:val="808080"/>
-                        <w:sz w:val="18"/>
-                        <w:szCs w:val="18"/>
-                      </w:rPr>
-                      <w:t>Tel : 06.14.84.38.38</w:t>
-                    </w:r>
-                  </w:p>
-                  <w:p>
-                    <w:pPr>
-                      <w:pStyle w:val="StylePourEntete"/>
-                      <w:spacing w:line="360" w:lineRule="auto"/>
-                      <w:rPr>
-                        <w:rFonts w:ascii="Calibri" w:hAnsi="Calibri"/>
-                        <w:i/>
-                        <w:color w:val="808080"/>
-                        <w:sz w:val="18"/>
-                        <w:szCs w:val="18"/>
-                      </w:rPr>
-                    </w:pPr>
-                    <w:r>
-                      <w:rPr>
-                        <w:rFonts w:ascii="Calibri" w:hAnsi="Calibri"/>
-                        <w:i/>
-                        <w:color w:val="808080"/>
-                        <w:sz w:val="18"/>
-                        <w:szCs w:val="18"/>
-                      </w:rPr>
-                      <w:t>Mail :</w:t>
-                    </w:r>
-                    <w:r>
-                      <w:rPr>
-                        <w:rFonts w:ascii="Calibri" w:hAnsi="Calibri"/>
-                        <w:i/>
-                        <w:color w:val="808080"/>
-                        <w:sz w:val="18"/>
-                        <w:szCs w:val="18"/>
-                      </w:rPr>
-                      <w:t xml:space="preserve"> </w:t>
-                    </w:r>
-                    <w:hyperlink ns7:id="rId4" w:history="1">
-                      <w:r>
-                        <w:rPr>
-                          <w:rStyle w:val="Lienhypertexte"/>
-                          <w:rFonts w:ascii="Calibri" w:hAnsi="Calibri"/>
-                          <w:i/>
-                          <w:sz w:val="18"/>
-                          <w:szCs w:val="18"/>
-                        </w:rPr>
-                        <w:t>ym.bienaime@pragmavox-avocat.fr</w:t>
-                      </w:r>
-                    </w:hyperlink>
-                  </w:p>
-                  <w:p>
-                    <w:pPr>
-                      <w:pStyle w:val="StylePourEntete"/>
-                      <w:spacing w:line="360" w:lineRule="auto"/>
-                      <w:rPr>
-                        <w:rFonts w:ascii="Calibri" w:hAnsi="Calibri"/>
-                        <w:i/>
-                        <w:color w:val="808080"/>
-                        <w:sz w:val="18"/>
-                        <w:szCs w:val="18"/>
-                      </w:rPr>
-                    </w:pPr>
-                    <w:r>
-                      <w:rPr>
-                        <w:rFonts w:ascii="Calibri" w:hAnsi="Calibri"/>
-                        <w:i/>
-                        <w:color w:val="808080"/>
-                        <w:sz w:val="18"/>
-                        <w:szCs w:val="18"/>
-                      </w:rPr>
-                      <w:t xml:space="preserve">Mail 2 : </w:t>
-                    </w:r>
-                    <w:hyperlink ns7:id="rId5" w:history="1">
-                      <w:r>
-                        <w:rPr>
-                          <w:rStyle w:val="Lienhypertexte"/>
-                          <w:rFonts w:ascii="Calibri" w:hAnsi="Calibri"/>
-                          <w:i/>
-                          <w:sz w:val="18"/>
-                          <w:szCs w:val="18"/>
-                        </w:rPr>
-                        <w:t>pragmavox.avocat@gmail.com</w:t>
-                      </w:r>
-                    </w:hyperlink>
-                  </w:p>
-                  <w:p>
-                    <w:pPr>
-                      <w:pStyle w:val="StylePourEntete"/>
-                      <w:spacing w:line="360" w:lineRule="auto"/>
-                      <w:rPr>
-                        <w:rFonts w:ascii="Calibri" w:hAnsi="Calibri"/>
-                        <w:i/>
-                        <w:color w:val="808080"/>
-                        <w:sz w:val="18"/>
-                        <w:szCs w:val="18"/>
-                      </w:rPr>
-                    </w:pPr>
-                  </w:p>
-                  <w:p>
-                    <w:pPr>
-                      <w:pStyle w:val="StylePourEntete"/>
-                      <w:spacing w:line="360" w:lineRule="auto"/>
-                      <w:rPr>
-                        <w:rFonts w:ascii="Calibri" w:hAnsi="Calibri"/>
-                        <w:i/>
-                        <w:color w:val="808080"/>
-                        <w:sz w:val="18"/>
-                        <w:szCs w:val="18"/>
-                      </w:rPr>
-                    </w:pPr>
-                  </w:p>
-                  <w:p>
-                    <w:pPr>
-                      <w:pStyle w:val="StylePourEntete"/>
-                      <w:spacing w:line="360" w:lineRule="auto"/>
-                      <w:rPr>
-                        <w:rFonts w:ascii="Calibri" w:hAnsi="Calibri"/>
-                        <w:i/>
-                        <w:color w:val="808080"/>
-                        <w:sz w:val="18"/>
-                        <w:szCs w:val="18"/>
-                      </w:rPr>
-                    </w:pPr>
-                  </w:p>
-                  <w:p>
-                    <w:pPr>
-                      <w:pStyle w:val="StylePourEntete"/>
-                      <w:spacing w:line="360" w:lineRule="auto"/>
-                      <w:rPr>
-                        <w:rFonts w:ascii="Calibri" w:hAnsi="Calibri"/>
-                        <w:i/>
-                        <w:color w:val="808080"/>
-                        <w:sz w:val="18"/>
-                        <w:szCs w:val="18"/>
-                      </w:rPr>
-                    </w:pPr>
-                  </w:p>
-                  <w:p>
-                    <w:pPr>
-                      <w:pStyle w:val="StylePourEntete"/>
-                      <w:spacing w:line="360" w:lineRule="auto"/>
-                      <w:rPr>
-                        <w:rFonts w:ascii="Calibri" w:hAnsi="Calibri"/>
-                        <w:i/>
-                        <w:color w:val="808080"/>
-                        <w:sz w:val="18"/>
-                        <w:szCs w:val="18"/>
-                      </w:rPr>
-                    </w:pPr>
-                  </w:p>
-                  <w:p>
-                    <w:pPr>
-                      <w:pStyle w:val="StylePourEntete"/>
-                      <w:spacing w:line="360" w:lineRule="auto"/>
-                      <w:rPr>
-                        <w:rFonts w:ascii="Calibri" w:hAnsi="Calibri"/>
-                        <w:i/>
-                        <w:color w:val="808080"/>
-                        <w:sz w:val="18"/>
-                        <w:szCs w:val="18"/>
-                      </w:rPr>
-                    </w:pPr>
-                  </w:p>
-                  <w:p>
-                    <w:pPr>
-                      <w:pStyle w:val="StylePourEntete"/>
-                      <w:spacing w:line="360" w:lineRule="auto"/>
-                      <w:rPr>
-                        <w:rFonts w:ascii="Calibri" w:hAnsi="Calibri"/>
-                        <w:i/>
-                        <w:color w:val="808080"/>
-                        <w:sz w:val="18"/>
-                        <w:szCs w:val="18"/>
-                      </w:rPr>
-                    </w:pPr>
-                  </w:p>
-                  <w:p>
-                    <w:pPr>
-                      <w:pStyle w:val="StylePourEntete"/>
-                      <w:spacing w:line="360" w:lineRule="auto"/>
-                      <w:rPr>
-                        <w:rFonts w:ascii="Calibri" w:hAnsi="Calibri"/>
-                        <w:i/>
-                        <w:color w:val="808080"/>
-                        <w:sz w:val="18"/>
-                        <w:szCs w:val="18"/>
-                      </w:rPr>
-                    </w:pPr>
-                  </w:p>
-                  <w:p>
-                    <w:pPr>
-                      <w:pStyle w:val="StylePourEntete"/>
-                      <w:spacing w:line="360" w:lineRule="auto"/>
-                      <w:rPr>
-                        <w:rFonts w:ascii="Calibri" w:hAnsi="Calibri"/>
-                        <w:i/>
-                        <w:color w:val="808080"/>
-                        <w:sz w:val="18"/>
-                        <w:szCs w:val="18"/>
-                      </w:rPr>
-                    </w:pPr>
-                  </w:p>
-                  <w:p>
-                    <w:pPr>
-                      <w:pStyle w:val="StylePourEntete"/>
-                      <w:spacing w:line="360" w:lineRule="auto"/>
-                      <w:rPr>
-                        <w:rFonts w:ascii="Calibri" w:hAnsi="Calibri"/>
-                        <w:i/>
-                        <w:color w:val="808080"/>
-                        <w:sz w:val="18"/>
-                        <w:szCs w:val="18"/>
-                      </w:rPr>
-                    </w:pPr>
-                  </w:p>
-                  <w:p>
-                    <w:pPr>
-                      <w:pStyle w:val="StylePourEntete"/>
-                      <w:spacing w:line="360" w:lineRule="auto"/>
-                      <w:rPr>
-                        <w:rFonts w:ascii="Calibri" w:hAnsi="Calibri"/>
-                        <w:i/>
-                        <w:color w:val="808080"/>
-                        <w:sz w:val="18"/>
-                        <w:szCs w:val="18"/>
-                      </w:rPr>
-                    </w:pPr>
-                  </w:p>
-                  <w:p>
-                    <w:pPr>
-                      <w:pStyle w:val="StylePourEntete"/>
-                      <w:spacing w:line="360" w:lineRule="auto"/>
-                      <w:rPr>
-                        <w:rFonts w:ascii="Calibri" w:hAnsi="Calibri"/>
-                        <w:i/>
-                        <w:color w:val="808080"/>
-                        <w:sz w:val="18"/>
-                        <w:szCs w:val="18"/>
-                      </w:rPr>
-                    </w:pPr>
-                    <w:r>
-                      <w:rPr>
-                        <w:rFonts w:ascii="Calibri" w:hAnsi="Calibri"/>
-                        <w:i/>
-                        <w:color w:val="808080"/>
-                        <w:sz w:val="18"/>
-                        <w:szCs w:val="18"/>
-                      </w:rPr>
-                      <w:t>SELARL D’AVOCAT</w:t>
-                    </w:r>
-                  </w:p>
-                  <w:p>
-                    <w:pPr>
-                      <w:pStyle w:val="StylePourEntete"/>
-                      <w:spacing w:line="360" w:lineRule="auto"/>
-                      <w:rPr>
-                        <w:rFonts w:ascii="Calibri" w:hAnsi="Calibri"/>
-                        <w:i/>
-                        <w:color w:val="808080"/>
-                        <w:sz w:val="18"/>
-                        <w:szCs w:val="18"/>
-                        <w:lang w:val="en-US"/>
-                      </w:rPr>
-                    </w:pPr>
-                    <w:r>
-                      <w:rPr>
-                        <w:rFonts w:ascii="Calibri" w:hAnsi="Calibri"/>
-                        <w:i/>
-                        <w:color w:val="808080"/>
-                        <w:sz w:val="18"/>
-                        <w:szCs w:val="18"/>
-                        <w:lang w:val="en-US"/>
-                      </w:rPr>
-                      <w:t xml:space="preserve">Siret : </w:t>
-                    </w:r>
-                    <w:r>
-                      <w:rPr>
-                        <w:rFonts w:ascii="Calibri" w:hAnsi="Calibri"/>
-                        <w:i/>
-                        <w:color w:val="808080"/>
-                        <w:sz w:val="18"/>
-                        <w:szCs w:val="18"/>
-                        <w:lang w:val="en-US"/>
-                      </w:rPr>
-                      <w:t>98260027200016</w:t>
-                    </w:r>
-                  </w:p>
-                  <w:p>
-                    <w:pPr>
-                      <w:pStyle w:val="StylePourEntete"/>
-                      <w:spacing w:line="360" w:lineRule="auto"/>
-                      <w:rPr>
-                        <w:rFonts w:ascii="Calibri" w:hAnsi="Calibri"/>
-                        <w:i/>
-                        <w:color w:val="808080"/>
-                        <w:sz w:val="18"/>
-                        <w:szCs w:val="18"/>
-                        <w:lang w:val="en-US"/>
-                      </w:rPr>
-                    </w:pPr>
-                    <w:r>
-                      <w:rPr>
-                        <w:rFonts w:ascii="Calibri" w:hAnsi="Calibri"/>
-                        <w:i/>
-                        <w:color w:val="808080"/>
-                        <w:sz w:val="18"/>
-                        <w:szCs w:val="18"/>
-                        <w:lang w:val="en-US"/>
-                      </w:rPr>
-                      <w:t xml:space="preserve">N° TVA : </w:t>
-                    </w:r>
-                    <w:r>
-                      <w:rPr>
-                        <w:rFonts w:ascii="Calibri" w:hAnsi="Calibri"/>
-                        <w:i/>
-                        <w:color w:val="808080"/>
-                        <w:sz w:val="18"/>
-                        <w:szCs w:val="18"/>
-                        <w:lang w:val="en-US"/>
-                      </w:rPr>
-                      <w:t>FR25982600272</w:t>
-                    </w:r>
-                  </w:p>
-                  <w:p>
-                    <w:pPr>
-                      <w:pStyle w:val="StylePourEntete"/>
-                      <w:spacing w:line="360" w:lineRule="auto"/>
-                      <w:rPr>
-                        <w:rFonts w:ascii="Calibri" w:hAnsi="Calibri"/>
-                        <w:i/>
-                        <w:color w:val="808080"/>
-                        <w:sz w:val="18"/>
-                        <w:szCs w:val="18"/>
-                        <w:lang w:val="en-US"/>
-                      </w:rPr>
-                    </w:pPr>
-                  </w:p>
-                  <w:p>
-                    <w:pPr>
-                      <w:pStyle w:val="StylePourEntete"/>
-                      <w:spacing w:line="360" w:lineRule="auto"/>
-                      <w:rPr>
-                        <w:rFonts w:ascii="Calibri" w:hAnsi="Calibri"/>
-                        <w:i/>
-                        <w:color w:val="808080"/>
-                        <w:sz w:val="18"/>
-                        <w:szCs w:val="18"/>
-                        <w:lang w:val="en-US"/>
-                      </w:rPr>
-                    </w:pPr>
-                  </w:p>
-                  <w:p>
-                    <w:pPr>
-                      <w:pStyle w:val="StylePourEntete"/>
-                      <w:spacing w:line="360" w:lineRule="auto"/>
-                      <w:rPr>
-                        <w:rFonts w:ascii="Calibri" w:hAnsi="Calibri"/>
-                        <w:i/>
-                        <w:color w:val="808080"/>
-                        <w:sz w:val="18"/>
-                        <w:szCs w:val="18"/>
-                        <w:lang w:val="en-US"/>
-                      </w:rPr>
-                    </w:pPr>
-                  </w:p>
-                  <w:p>
-                    <w:pPr>
-                      <w:pStyle w:val="StylePourEntete"/>
-                      <w:spacing w:line="360" w:lineRule="auto"/>
-                      <w:rPr>
-                        <w:rFonts w:ascii="Calibri" w:hAnsi="Calibri"/>
-                        <w:i/>
-                        <w:color w:val="808080"/>
-                        <w:sz w:val="18"/>
-                        <w:szCs w:val="18"/>
-                        <w:lang w:val="en-US"/>
-                      </w:rPr>
-                    </w:pPr>
-                  </w:p>
-                  <w:p>
-                    <w:pPr>
-                      <w:pStyle w:val="StylePourEntete"/>
-                      <w:spacing w:line="360" w:lineRule="auto"/>
-                      <w:rPr>
-                        <w:rFonts w:ascii="Calibri" w:hAnsi="Calibri"/>
-                        <w:i/>
-                        <w:color w:val="808080"/>
-                        <w:sz w:val="18"/>
-                        <w:szCs w:val="18"/>
-                        <w:lang w:val="en-US"/>
-                      </w:rPr>
-                    </w:pPr>
-                  </w:p>
-                  <w:p>
-                    <w:pPr>
-                      <w:pStyle w:val="StylePourEntete"/>
-                      <w:spacing w:line="360" w:lineRule="auto"/>
-                      <w:rPr>
-                        <w:rFonts w:ascii="Calibri" w:hAnsi="Calibri"/>
-                        <w:i/>
-                        <w:color w:val="808080"/>
-                        <w:sz w:val="18"/>
-                        <w:szCs w:val="18"/>
-                        <w:lang w:val="en-US"/>
-                      </w:rPr>
-                    </w:pPr>
-                  </w:p>
-                  <w:p>
-                    <w:pPr>
-                      <w:pStyle w:val="StylePourEntete"/>
-                      <w:rPr>
-                        <w:rFonts w:ascii="Calibri" w:hAnsi="Calibri"/>
-                        <w:color w:val="808080"/>
-                        <w:sz w:val="18"/>
-                        <w:szCs w:val="18"/>
-                        <w:lang w:val="en-US"/>
-                      </w:rPr>
-                    </w:pPr>
-                  </w:p>
-                  <w:p>
-                    <w:pPr>
-                      <w:pStyle w:val="StylePourEntete"/>
-                      <w:rPr>
-                        <w:rFonts w:ascii="Calibri" w:hAnsi="Calibri"/>
-                        <w:color w:val="808080"/>
-                        <w:sz w:val="18"/>
-                        <w:szCs w:val="18"/>
-                        <w:lang w:val="en-US"/>
-                      </w:rPr>
-                    </w:pPr>
-                  </w:p>
-                  <w:p>
-                    <w:pPr>
-                      <w:pStyle w:val="StylePourEntete"/>
-                      <w:rPr>
-                        <w:rFonts w:ascii="Calibri" w:hAnsi="Calibri"/>
-                        <w:b/>
-                        <w:color w:val="17365D"/>
-                        <w:sz w:val="18"/>
-                        <w:szCs w:val="18"/>
-                        <w:lang w:val="en-US"/>
-                      </w:rPr>
-                    </w:pPr>
-                  </w:p>
-                  <w:p>
-                    <w:pPr>
-                      <w:pStyle w:val="StylePourEntete"/>
-                      <w:rPr>
-                        <w:rFonts w:ascii="Calibri" w:hAnsi="Calibri"/>
-                        <w:i/>
-                        <w:color w:val="808080"/>
-                        <w:sz w:val="18"/>
-                        <w:szCs w:val="18"/>
-                        <w:lang w:val="en-US"/>
-                      </w:rPr>
-                    </w:pPr>
-                  </w:p>
-                  <w:p>
-                    <w:pPr>
-                      <w:pStyle w:val="StylePourEntete"/>
-                      <w:rPr>
-                        <w:rFonts w:ascii="Calibri" w:hAnsi="Calibri"/>
-                        <w:color w:val="808080"/>
-                        <w:sz w:val="18"/>
-                        <w:szCs w:val="18"/>
-                        <w:lang w:val="en-US"/>
-                      </w:rPr>
-                    </w:pPr>
-                  </w:p>
-                  <w:p>
-                    <w:pPr>
-                      <w:pStyle w:val="StylePourEntete"/>
-                      <w:rPr>
-                        <w:rFonts w:ascii="Calibri" w:hAnsi="Calibri"/>
-                        <w:color w:val="808080"/>
-                        <w:sz w:val="18"/>
-                        <w:szCs w:val="18"/>
-                        <w:lang w:val="en-US"/>
-                      </w:rPr>
-                    </w:pPr>
-                  </w:p>
-                </w:txbxContent>
-              </ns10:textbox>
-              <ns12:wrap anchorx="page" anchory="page"/>
-            </ns10:shape>
-          </w:pict>
-        </mc:Fallback>
-      </mc:AlternateContent>
-    </w:r>
-  </w:p>
-  <w:p>
-    <w:pPr>
-      <w:pStyle w:val="En-tte"/>
-    </w:pPr>
-  </w:p>
-  <w:p>
-    <w:pPr>
-      <w:pStyle w:val="En-tte"/>
-    </w:pPr>
-  </w:p>
+<w:hdr xmlns:w="http://schemas.openxmlformats.org/wordprocessingml/2006/main">
+  <w:p/>
 </w:hdr>
 </file>
 

</xml_diff>